<commit_message>
feat: print all statements as multi-page PDF + unlock Word logo
- PDF Export now prints all statements (one per page) instead of only
  the currently selected card; background/footer repeat on every page
- Word template: remove o:lock from VML header shape so the logo and
  red line are draggable in Word after export

Co-Authored-By: Claude Sonnet 4.6 <noreply@anthropic.com>
</commit_message>
<xml_diff>
--- a/src/app/api/statement/docx/_template/template.docx
+++ b/src/app/api/statement/docx/_template/template.docx
@@ -2008,12 +2008,11 @@
     </w:pPr>
     <w:r>
       <w:pict>
-        <v:shape id="WordPictureWatermark290189" o:spid="_x0000_s1030" o:spt="75" type="#_x0000_t75" style="position:absolute;left:0pt;height:757.8pt;width:535.8pt;mso-position-horizontal:center;mso-position-horizontal-relative:margin;mso-position-vertical:center;mso-position-vertical-relative:margin;z-index:-251655168;mso-width-relative:page;mso-height-relative:page;" filled="f" o:preferrelative="t" stroked="f" coordsize="21600,21600" o:allowincell="f">
+        <v:shape id="ZealerLogoShape1" o:spid="_x0000_s2001" o:spt="75" type="#_x0000_t75" style="position:absolute;left:0pt;height:757.8pt;width:535.8pt;mso-position-horizontal:center;mso-position-horizontal-relative:page;mso-position-vertical:top;mso-position-vertical-relative:page;margin-top:80pt;z-index:-251655168;mso-width-relative:page;mso-height-relative:page;" filled="f" o:preferrelative="t" stroked="f" coordsize="21600,21600">
           <v:path/>
           <v:fill on="f" focussize="0,0"/>
           <v:stroke on="f" joinstyle="miter"/>
           <v:imagedata r:id="rId1" o:title="Letter_Background_3"/>
-          <o:lock v:ext="edit" aspectratio="t"/>
         </v:shape>
       </w:pict>
     </w:r>
@@ -2029,12 +2028,11 @@
     </w:pPr>
     <w:r>
       <w:pict>
-        <v:shape id="WordPictureWatermark290188" o:spid="_x0000_s1029" o:spt="75" type="#_x0000_t75" style="position:absolute;left:0pt;height:757.8pt;width:535.8pt;mso-position-horizontal:center;mso-position-horizontal-relative:margin;mso-position-vertical:center;mso-position-vertical-relative:margin;z-index:-251656192;mso-width-relative:page;mso-height-relative:page;" filled="f" o:preferrelative="t" stroked="f" coordsize="21600,21600" o:allowincell="f">
+        <v:shape id="WordPictureWatermark290188" o:spid="_x0000_s1029" o:spt="75" type="#_x0000_t75" style="position:absolute;left:0pt;height:757.8pt;width:535.8pt;mso-position-horizontal:center;mso-position-horizontal-relative:page;mso-position-vertical:top;mso-position-vertical-relative:page;margin-top:80pt;z-index:-251656192;mso-width-relative:page;mso-height-relative:page;" filled="f" o:preferrelative="t" stroked="f" coordsize="21600,21600">
           <v:path/>
           <v:fill on="f" focussize="0,0"/>
           <v:stroke on="f" joinstyle="miter"/>
           <v:imagedata r:id="rId1" o:title="Letter_Background_3"/>
-          <o:lock v:ext="edit" aspectratio="t"/>
         </v:shape>
       </w:pict>
     </w:r>
@@ -2051,12 +2049,11 @@
     </w:pPr>
     <w:r>
       <w:pict>
-        <v:shape id="WordPictureWatermark290187" o:spid="_x0000_s1028" o:spt="75" type="#_x0000_t75" style="position:absolute;left:0pt;height:757.8pt;width:535.8pt;mso-position-horizontal:center;mso-position-horizontal-relative:margin;mso-position-vertical:center;mso-position-vertical-relative:margin;z-index:-251657216;mso-width-relative:page;mso-height-relative:page;" filled="f" o:preferrelative="t" stroked="f" coordsize="21600,21600" o:allowincell="f">
+        <v:shape id="WordPictureWatermark290187" o:spid="_x0000_s1028" o:spt="75" type="#_x0000_t75" style="position:absolute;left:0pt;height:757.8pt;width:535.8pt;mso-position-horizontal:center;mso-position-horizontal-relative:page;mso-position-vertical:top;mso-position-vertical-relative:page;margin-top:80pt;z-index:-251657216;mso-width-relative:page;mso-height-relative:page;" filled="f" o:preferrelative="t" stroked="f" coordsize="21600,21600">
           <v:path/>
           <v:fill on="f" focussize="0,0"/>
           <v:stroke on="f" joinstyle="miter"/>
           <v:imagedata r:id="rId1" o:title="Letter_Background_3"/>
-          <o:lock v:ext="edit" aspectratio="t"/>
         </v:shape>
       </w:pict>
     </w:r>

</xml_diff>

<commit_message>
feat: print all statements as multi-page PDF + unlock Word logo (#4)
- PDF Export now prints all statements (one per page) instead of only
  the currently selected card; background/footer repeat on every page
- Word template: remove o:lock from VML header shape so the logo and
  red line are draggable in Word after export

Co-authored-by: Claude Sonnet 4.6 <noreply@anthropic.com>
</commit_message>
<xml_diff>
--- a/src/app/api/statement/docx/_template/template.docx
+++ b/src/app/api/statement/docx/_template/template.docx
@@ -2008,12 +2008,11 @@
     </w:pPr>
     <w:r>
       <w:pict>
-        <v:shape id="WordPictureWatermark290189" o:spid="_x0000_s1030" o:spt="75" type="#_x0000_t75" style="position:absolute;left:0pt;height:757.8pt;width:535.8pt;mso-position-horizontal:center;mso-position-horizontal-relative:margin;mso-position-vertical:center;mso-position-vertical-relative:margin;z-index:-251655168;mso-width-relative:page;mso-height-relative:page;" filled="f" o:preferrelative="t" stroked="f" coordsize="21600,21600" o:allowincell="f">
+        <v:shape id="ZealerLogoShape1" o:spid="_x0000_s2001" o:spt="75" type="#_x0000_t75" style="position:absolute;left:0pt;height:757.8pt;width:535.8pt;mso-position-horizontal:center;mso-position-horizontal-relative:page;mso-position-vertical:top;mso-position-vertical-relative:page;margin-top:80pt;z-index:-251655168;mso-width-relative:page;mso-height-relative:page;" filled="f" o:preferrelative="t" stroked="f" coordsize="21600,21600">
           <v:path/>
           <v:fill on="f" focussize="0,0"/>
           <v:stroke on="f" joinstyle="miter"/>
           <v:imagedata r:id="rId1" o:title="Letter_Background_3"/>
-          <o:lock v:ext="edit" aspectratio="t"/>
         </v:shape>
       </w:pict>
     </w:r>
@@ -2029,12 +2028,11 @@
     </w:pPr>
     <w:r>
       <w:pict>
-        <v:shape id="WordPictureWatermark290188" o:spid="_x0000_s1029" o:spt="75" type="#_x0000_t75" style="position:absolute;left:0pt;height:757.8pt;width:535.8pt;mso-position-horizontal:center;mso-position-horizontal-relative:margin;mso-position-vertical:center;mso-position-vertical-relative:margin;z-index:-251656192;mso-width-relative:page;mso-height-relative:page;" filled="f" o:preferrelative="t" stroked="f" coordsize="21600,21600" o:allowincell="f">
+        <v:shape id="WordPictureWatermark290188" o:spid="_x0000_s1029" o:spt="75" type="#_x0000_t75" style="position:absolute;left:0pt;height:757.8pt;width:535.8pt;mso-position-horizontal:center;mso-position-horizontal-relative:page;mso-position-vertical:top;mso-position-vertical-relative:page;margin-top:80pt;z-index:-251656192;mso-width-relative:page;mso-height-relative:page;" filled="f" o:preferrelative="t" stroked="f" coordsize="21600,21600">
           <v:path/>
           <v:fill on="f" focussize="0,0"/>
           <v:stroke on="f" joinstyle="miter"/>
           <v:imagedata r:id="rId1" o:title="Letter_Background_3"/>
-          <o:lock v:ext="edit" aspectratio="t"/>
         </v:shape>
       </w:pict>
     </w:r>
@@ -2051,12 +2049,11 @@
     </w:pPr>
     <w:r>
       <w:pict>
-        <v:shape id="WordPictureWatermark290187" o:spid="_x0000_s1028" o:spt="75" type="#_x0000_t75" style="position:absolute;left:0pt;height:757.8pt;width:535.8pt;mso-position-horizontal:center;mso-position-horizontal-relative:margin;mso-position-vertical:center;mso-position-vertical-relative:margin;z-index:-251657216;mso-width-relative:page;mso-height-relative:page;" filled="f" o:preferrelative="t" stroked="f" coordsize="21600,21600" o:allowincell="f">
+        <v:shape id="WordPictureWatermark290187" o:spid="_x0000_s1028" o:spt="75" type="#_x0000_t75" style="position:absolute;left:0pt;height:757.8pt;width:535.8pt;mso-position-horizontal:center;mso-position-horizontal-relative:page;mso-position-vertical:top;mso-position-vertical-relative:page;margin-top:80pt;z-index:-251657216;mso-width-relative:page;mso-height-relative:page;" filled="f" o:preferrelative="t" stroked="f" coordsize="21600,21600">
           <v:path/>
           <v:fill on="f" focussize="0,0"/>
           <v:stroke on="f" joinstyle="miter"/>
           <v:imagedata r:id="rId1" o:title="Letter_Background_3"/>
-          <o:lock v:ext="edit" aspectratio="t"/>
         </v:shape>
       </w:pict>
     </w:r>

</xml_diff>